<commit_message>
Design figure 2: stage groups, Korean node descriptions, decision diamonds
</commit_message>
<xml_diff>
--- a/deliverables/RAG-Design_판교-9반_김정인+김진수+전진만+정원준.docx
+++ b/deliverables/RAG-Design_판교-9반_김정인+김진수+전진만+정원준.docx
@@ -23054,7 +23054,7 @@
           <w:b w:val="0"/>
           <w:sz w:val="20"/>
         </w:rPr>
-        <w:t>흐름은 초기화, 선정 검증, 공통 검색, 기술 조사, 네 관점 병렬 평가, 종합, Judge, 재실행 판단, 보고서 작성과 검수, PDF 순서이다. 그림 2에 노드 18개를 모두 그렸고, Mermaid 소스는 그다음에 싣는다.</w:t>
+        <w:t>흐름은 네 단계로 나뉜다. ① 선정 검증과 RAG 준비(공통 검색 반복 포함), ② 기술 조사와 네 관점 병렬 평가, 종합, ③ Judge 검증과 선택적 재실행, ④ 보고서 작성·검수와 PDF 생성이다. 그림 2에 노드 18개를 모두 그렸고, Mermaid 소스는 그다음에 싣는다.</w:t>
       </w:r>
     </w:p>
     <w:p>
@@ -23065,7 +23065,7 @@
       <w:r>
         <w:drawing>
           <wp:inline xmlns:a="http://schemas.openxmlformats.org/drawingml/2006/main" xmlns:pic="http://schemas.openxmlformats.org/drawingml/2006/picture">
-            <wp:extent cx="4031999" cy="6454801"/>
+            <wp:extent cx="4031999" cy="7104765"/>
             <wp:docPr id="3" name="Picture 3"/>
             <wp:cNvGraphicFramePr>
               <a:graphicFrameLocks noChangeAspect="1"/>
@@ -23086,7 +23086,7 @@
                   <pic:spPr>
                     <a:xfrm>
                       <a:off x="0" y="0"/>
-                      <a:ext cx="4031999" cy="6454801"/>
+                      <a:ext cx="4031999" cy="7104765"/>
                     </a:xfrm>
                     <a:prstGeom prst="rect"/>
                   </pic:spPr>
@@ -23109,7 +23109,7 @@
           <w:color w:val="555A6E"/>
           <w:sz w:val="17"/>
         </w:rPr>
-        <w:t>그림 2. 전체 그래프(노드 18개). 실선은 항상 지나는 경로, 점선은 조건에 따라 갈리는 경로이다</w:t>
+        <w:t>그림 2. 전체 그래프(노드 18개). 실선은 항상 지나는 경로, 점선은 조건에 따라 갈리는 경로이고, 마름모는 다음 경로를 정하는 노드이다</w:t>
       </w:r>
     </w:p>
     <w:p>
@@ -23163,7 +23163,7 @@
                 <w:color w:val="2B2F4A"/>
                 <w:sz w:val="15"/>
               </w:rPr>
-              <w:t>flowchart TD</w:t>
+              <w:t>flowchart TB</w:t>
             </w:r>
           </w:p>
           <w:p>
@@ -23177,7 +23177,7 @@
                 <w:color w:val="2B2F4A"/>
                 <w:sz w:val="15"/>
               </w:rPr>
-              <w:t xml:space="preserve">    H0(["Human 선정 (2안)&lt;br/&gt;config · --tech"]) --&gt; INIT["initialize"]</w:t>
+              <w:t xml:space="preserve">    H0(["Human 기술 선정 (2안)&lt;br/&gt;TurboQuant · ITME"]) --&gt; INIT</w:t>
             </w:r>
           </w:p>
           <w:p>
@@ -23191,7 +23191,7 @@
                 <w:color w:val="2B2F4A"/>
                 <w:sz w:val="15"/>
               </w:rPr>
-              <w:t xml:space="preserve">    INIT --&gt; VAL["selection_validator&lt;br/&gt;선정 검증·기록"]</w:t>
+              <w:t xml:space="preserve">    subgraph S1["1. 선정 검증 및 RAG 준비"]</w:t>
             </w:r>
           </w:p>
           <w:p>
@@ -23205,7 +23205,7 @@
                 <w:color w:val="2B2F4A"/>
                 <w:sz w:val="15"/>
               </w:rPr>
-              <w:t xml:space="preserve">    VAL --&gt; IDX["index_builder"]</w:t>
+              <w:t xml:space="preserve">        INIT["initialize&lt;br/&gt;State 초기화"] --&gt; VAL["selection_validator&lt;br/&gt;선정 타당성 검증·기록"]</w:t>
             </w:r>
           </w:p>
           <w:p>
@@ -23219,7 +23219,7 @@
                 <w:color w:val="2B2F4A"/>
                 <w:sz w:val="15"/>
               </w:rPr>
-              <w:t xml:space="preserve">    IDX --&gt; QP["query_planner"]</w:t>
+              <w:t xml:space="preserve">        VAL --&gt; IDX["index_builder&lt;br/&gt;PDF 로드·청킹·인덱스"]</w:t>
             </w:r>
           </w:p>
           <w:p>
@@ -23233,7 +23233,7 @@
                 <w:color w:val="2B2F4A"/>
                 <w:sz w:val="15"/>
               </w:rPr>
-              <w:t xml:space="preserve">    QP --&gt; RET["hybrid_retriever"]</w:t>
+              <w:t xml:space="preserve">        IDX --&gt; QP["query_planner&lt;br/&gt;기술별 개요 질의"]</w:t>
             </w:r>
           </w:p>
           <w:p>
@@ -23247,7 +23247,7 @@
                 <w:color w:val="2B2F4A"/>
                 <w:sz w:val="15"/>
               </w:rPr>
-              <w:t xml:space="preserve">    RET --&gt; GR["retrieval_grader"]</w:t>
+              <w:t xml:space="preserve">        QP --&gt; RET["hybrid_retriever&lt;br/&gt;3중 RRF + reranker"]</w:t>
             </w:r>
           </w:p>
           <w:p>
@@ -23261,7 +23261,7 @@
                 <w:color w:val="2B2F4A"/>
                 <w:sz w:val="15"/>
               </w:rPr>
-              <w:t xml:space="preserve">    GR -.-&gt;|"부족 · 재시도&lt;2"| QRW["query_rewriter"]</w:t>
+              <w:t xml:space="preserve">        RET --&gt; GR{"retrieval_grader&lt;br/&gt;검색 품질 충족?"}</w:t>
             </w:r>
           </w:p>
           <w:p>
@@ -23275,7 +23275,7 @@
                 <w:color w:val="2B2F4A"/>
                 <w:sz w:val="15"/>
               </w:rPr>
-              <w:t xml:space="preserve">    QRW --&gt; RET</w:t>
+              <w:t xml:space="preserve">        QRW["query_rewriter&lt;br/&gt;누락 요소 반영"]</w:t>
             </w:r>
           </w:p>
           <w:p>
@@ -23289,7 +23289,7 @@
                 <w:color w:val="2B2F4A"/>
                 <w:sz w:val="15"/>
               </w:rPr>
-              <w:t xml:space="preserve">    GR -.-&gt;|"충족 · 한도 소진"| TR["tech_research&lt;br/&gt;개요·한계"]</w:t>
+              <w:t xml:space="preserve">    end</w:t>
             </w:r>
           </w:p>
           <w:p>
@@ -23303,7 +23303,7 @@
                 <w:color w:val="2B2F4A"/>
                 <w:sz w:val="15"/>
               </w:rPr>
-              <w:t xml:space="preserve">    subgraph FAN[" "]</w:t>
+              <w:t xml:space="preserve">    subgraph S2["2. 기술 조사 및 관점별 병렬 평가"]</w:t>
             </w:r>
           </w:p>
           <w:p>
@@ -23317,7 +23317,7 @@
                 <w:color w:val="2B2F4A"/>
                 <w:sz w:val="15"/>
               </w:rPr>
-              <w:t xml:space="preserve">        direction LR</w:t>
+              <w:t xml:space="preserve">        TR["tech_research&lt;br/&gt;원리·실험 조건·한계"]</w:t>
             </w:r>
           </w:p>
           <w:p>
@@ -23331,7 +23331,7 @@
                 <w:color w:val="2B2F4A"/>
                 <w:sz w:val="15"/>
               </w:rPr>
-              <w:t xml:space="preserve">        TRL["trl_assessor&lt;br/&gt;(내부 반복≤2)"]</w:t>
+              <w:t xml:space="preserve">        subgraph FAN["관점 평가 4개 (병렬, 노드 내부 검색 반복 ≤2)"]</w:t>
             </w:r>
           </w:p>
           <w:p>
@@ -23345,7 +23345,7 @@
                 <w:color w:val="2B2F4A"/>
                 <w:sz w:val="15"/>
               </w:rPr>
-              <w:t xml:space="preserve">        MK["market_evaluator&lt;br/&gt;(내부 반복≤2)"]</w:t>
+              <w:t xml:space="preserve">            TRL["trl_assessor&lt;br/&gt;TRL"]</w:t>
             </w:r>
           </w:p>
           <w:p>
@@ -23359,7 +23359,7 @@
                 <w:color w:val="2B2F4A"/>
                 <w:sz w:val="15"/>
               </w:rPr>
-              <w:t xml:space="preserve">        SH["stakeholder_evaluator&lt;br/&gt;(내부 반복≤2)"]</w:t>
+              <w:t xml:space="preserve">            MK["market_evaluator&lt;br/&gt;시장"]</w:t>
             </w:r>
           </w:p>
           <w:p>
@@ -23373,7 +23373,7 @@
                 <w:color w:val="2B2F4A"/>
                 <w:sz w:val="15"/>
               </w:rPr>
-              <w:t xml:space="preserve">        DM["domain_evaluator&lt;br/&gt;(내부 반복≤2)"]</w:t>
+              <w:t xml:space="preserve">            SH["stakeholder_evaluator&lt;br/&gt;이해관계자"]</w:t>
             </w:r>
           </w:p>
           <w:p>
@@ -23387,7 +23387,7 @@
                 <w:color w:val="2B2F4A"/>
                 <w:sz w:val="15"/>
               </w:rPr>
-              <w:t xml:space="preserve">    end</w:t>
+              <w:t xml:space="preserve">            DM["domain_evaluator&lt;br/&gt;도메인 W1·W2"]</w:t>
             </w:r>
           </w:p>
           <w:p>
@@ -23401,7 +23401,7 @@
                 <w:color w:val="2B2F4A"/>
                 <w:sz w:val="15"/>
               </w:rPr>
-              <w:t xml:space="preserve">    TR --&gt; TRL &amp; MK &amp; SH &amp; DM</w:t>
+              <w:t xml:space="preserve">        end</w:t>
             </w:r>
           </w:p>
           <w:p>
@@ -23415,7 +23415,7 @@
                 <w:color w:val="2B2F4A"/>
                 <w:sz w:val="15"/>
               </w:rPr>
-              <w:t xml:space="preserve">    TRL &amp; MK &amp; SH &amp; DM --&gt; SY["synthesizer (defer)"]</w:t>
+              <w:t xml:space="preserve">        TR --&gt; TRL &amp; MK &amp; SH &amp; DM</w:t>
             </w:r>
           </w:p>
           <w:p>
@@ -23429,7 +23429,7 @@
                 <w:color w:val="2B2F4A"/>
                 <w:sz w:val="15"/>
               </w:rPr>
-              <w:t xml:space="preserve">    SY --&gt; JD["judge"]</w:t>
+              <w:t xml:space="preserve">        TRL &amp; MK &amp; SH &amp; DM --&gt; SY["synthesizer&lt;br/&gt;일치·상충 · H1~H4"]</w:t>
             </w:r>
           </w:p>
           <w:p>
@@ -23443,7 +23443,7 @@
                 <w:color w:val="2B2F4A"/>
                 <w:sz w:val="15"/>
               </w:rPr>
-              <w:t xml:space="preserve">    JD --&gt; RR["retry_router"]</w:t>
+              <w:t xml:space="preserve">    end</w:t>
             </w:r>
           </w:p>
           <w:p>
@@ -23457,7 +23457,7 @@
                 <w:color w:val="2B2F4A"/>
                 <w:sz w:val="15"/>
               </w:rPr>
-              <w:t xml:space="preserve">    RR -.-&gt;|"미달 관점만 · 재실행&lt;2"| FAN</w:t>
+              <w:t xml:space="preserve">    subgraph S3["3. Judge 검증 및 선택적 재실행"]</w:t>
             </w:r>
           </w:p>
           <w:p>
@@ -23471,7 +23471,7 @@
                 <w:color w:val="2B2F4A"/>
                 <w:sz w:val="15"/>
               </w:rPr>
-              <w:t xml:space="preserve">    RR -.-&gt;|"재실행 대상 없음"| RWR["report_writer"]</w:t>
+              <w:t xml:space="preserve">        JD["judge&lt;br/&gt;근거·중립·다양성·완결성"] --&gt; RR{"retry_router&lt;br/&gt;재실행?"}</w:t>
             </w:r>
           </w:p>
           <w:p>
@@ -23485,7 +23485,7 @@
                 <w:color w:val="2B2F4A"/>
                 <w:sz w:val="15"/>
               </w:rPr>
-              <w:t xml:space="preserve">    RWR --&gt; FC["final_check"]</w:t>
+              <w:t xml:space="preserve">    end</w:t>
             </w:r>
           </w:p>
           <w:p>
@@ -23499,7 +23499,7 @@
                 <w:color w:val="2B2F4A"/>
                 <w:sz w:val="15"/>
               </w:rPr>
-              <w:t xml:space="preserve">    FC -.-&gt;|"실패 · 수정&lt;1"| RWR</w:t>
+              <w:t xml:space="preserve">    subgraph S4["4. 보고서 생성·검수"]</w:t>
             </w:r>
           </w:p>
           <w:p>
@@ -23513,7 +23513,7 @@
                 <w:color w:val="2B2F4A"/>
                 <w:sz w:val="15"/>
               </w:rPr>
-              <w:t xml:space="preserve">    FC -.-&gt;|"통과"| PDF["pdf_renderer → END"]</w:t>
+              <w:t xml:space="preserve">        RWR["report_writer&lt;br/&gt;본문·REFERENCE 작성"] --&gt; FC{"final_check&lt;br/&gt;검수 통과?"}</w:t>
             </w:r>
           </w:p>
           <w:p>
@@ -23527,7 +23527,7 @@
                 <w:color w:val="2B2F4A"/>
                 <w:sz w:val="15"/>
               </w:rPr>
-              <w:t xml:space="preserve">    FC -.-&gt;|"한도 소진 · 후처리"| PDF</w:t>
+              <w:t xml:space="preserve">        FC -.-&gt;|"수정 필요 · 수정&lt;1"| RWR</w:t>
             </w:r>
           </w:p>
           <w:p>
@@ -23541,7 +23541,7 @@
                 <w:color w:val="2B2F4A"/>
                 <w:sz w:val="15"/>
               </w:rPr>
-              <w:t xml:space="preserve">    classDef agent fill:#EEE8FA,stroke:#7F4ACB,color:#161A58;</w:t>
+              <w:t xml:space="preserve">        FC -.-&gt;|"통과 · 한도 소진 후 보정"| PDF["pdf_renderer&lt;br/&gt;SKALA 양식 PDF"]</w:t>
             </w:r>
           </w:p>
           <w:p>
@@ -23555,7 +23555,7 @@
                 <w:color w:val="2B2F4A"/>
                 <w:sz w:val="15"/>
               </w:rPr>
-              <w:t xml:space="preserve">    classDef util fill:#F2F3F8,stroke:#9AA0B8,color:#161A58;</w:t>
+              <w:t xml:space="preserve">    end</w:t>
             </w:r>
           </w:p>
           <w:p>
@@ -23569,7 +23569,7 @@
                 <w:color w:val="2B2F4A"/>
                 <w:sz w:val="15"/>
               </w:rPr>
-              <w:t xml:space="preserve">    classDef human fill:#E8F4EC,stroke:#2E7D4F,color:#16381F;</w:t>
+              <w:t xml:space="preserve">    GR -.-&gt;|"충족 · 한도 소진"| TR</w:t>
             </w:r>
           </w:p>
           <w:p>
@@ -23583,7 +23583,7 @@
                 <w:color w:val="2B2F4A"/>
                 <w:sz w:val="15"/>
               </w:rPr>
-              <w:t xml:space="preserve">    classDef gate fill:#FFF6E5,stroke:#D08A00,color:#3A2A00;</w:t>
+              <w:t xml:space="preserve">    GR -.-&gt;|"부족 · 재시도&lt;2"| QRW</w:t>
             </w:r>
           </w:p>
           <w:p>
@@ -23597,7 +23597,7 @@
                 <w:color w:val="2B2F4A"/>
                 <w:sz w:val="15"/>
               </w:rPr>
-              <w:t xml:space="preserve">    class VAL,TR,TRL,MK,SH,DM,SY,JD,RWR agent;</w:t>
+              <w:t xml:space="preserve">    QRW --&gt; RET</w:t>
             </w:r>
           </w:p>
           <w:p>
@@ -23611,7 +23611,7 @@
                 <w:color w:val="2B2F4A"/>
                 <w:sz w:val="15"/>
               </w:rPr>
-              <w:t xml:space="preserve">    class INIT,IDX,QP,RET,QRW,PDF util;</w:t>
+              <w:t xml:space="preserve">    SY --&gt; JD</w:t>
             </w:r>
           </w:p>
           <w:p>
@@ -23625,7 +23625,7 @@
                 <w:color w:val="2B2F4A"/>
                 <w:sz w:val="15"/>
               </w:rPr>
-              <w:t xml:space="preserve">    class H0 human;</w:t>
+              <w:t xml:space="preserve">    RR -.-&gt;|"미달 관점만 · 재실행&lt;2"| FAN</w:t>
             </w:r>
           </w:p>
           <w:p>
@@ -23639,7 +23639,7 @@
                 <w:color w:val="2B2F4A"/>
                 <w:sz w:val="15"/>
               </w:rPr>
-              <w:t xml:space="preserve">    class GR,RR,FC gate;</w:t>
+              <w:t xml:space="preserve">    RR -.-&gt;|"모두 통과 · 한도 소진"| RWR</w:t>
             </w:r>
           </w:p>
           <w:p>
@@ -23653,7 +23653,189 @@
                 <w:color w:val="2B2F4A"/>
                 <w:sz w:val="15"/>
               </w:rPr>
-              <w:t xml:space="preserve">    style FAN fill:#FBFAFE,stroke:#7F4ACB,stroke-dasharray:4 3,color:#161A58</w:t>
+              <w:t xml:space="preserve">    PDF --&gt; END(["END"])</w:t>
+            </w:r>
+          </w:p>
+          <w:p>
+            <w:pPr>
+              <w:spacing w:after="0" w:line="240" w:lineRule="auto"/>
+            </w:pPr>
+            <w:r>
+              <w:rPr>
+                <w:rFonts w:ascii="D2Coding" w:hAnsi="D2Coding" w:eastAsia="맑은 고딕" w:cs="D2Coding"/>
+                <w:b w:val="0"/>
+                <w:color w:val="2B2F4A"/>
+                <w:sz w:val="15"/>
+              </w:rPr>
+              <w:t xml:space="preserve">    classDef agent fill:#EEE8FA,stroke:#7F4ACB,color:#161A58;</w:t>
+            </w:r>
+          </w:p>
+          <w:p>
+            <w:pPr>
+              <w:spacing w:after="0" w:line="240" w:lineRule="auto"/>
+            </w:pPr>
+            <w:r>
+              <w:rPr>
+                <w:rFonts w:ascii="D2Coding" w:hAnsi="D2Coding" w:eastAsia="맑은 고딕" w:cs="D2Coding"/>
+                <w:b w:val="0"/>
+                <w:color w:val="2B2F4A"/>
+                <w:sz w:val="15"/>
+              </w:rPr>
+              <w:t xml:space="preserve">    classDef util fill:#F2F3F8,stroke:#9AA0B8,color:#161A58;</w:t>
+            </w:r>
+          </w:p>
+          <w:p>
+            <w:pPr>
+              <w:spacing w:after="0" w:line="240" w:lineRule="auto"/>
+            </w:pPr>
+            <w:r>
+              <w:rPr>
+                <w:rFonts w:ascii="D2Coding" w:hAnsi="D2Coding" w:eastAsia="맑은 고딕" w:cs="D2Coding"/>
+                <w:b w:val="0"/>
+                <w:color w:val="2B2F4A"/>
+                <w:sz w:val="15"/>
+              </w:rPr>
+              <w:t xml:space="preserve">    classDef human fill:#E8F4EC,stroke:#2E7D4F,color:#16381F;</w:t>
+            </w:r>
+          </w:p>
+          <w:p>
+            <w:pPr>
+              <w:spacing w:after="0" w:line="240" w:lineRule="auto"/>
+            </w:pPr>
+            <w:r>
+              <w:rPr>
+                <w:rFonts w:ascii="D2Coding" w:hAnsi="D2Coding" w:eastAsia="맑은 고딕" w:cs="D2Coding"/>
+                <w:b w:val="0"/>
+                <w:color w:val="2B2F4A"/>
+                <w:sz w:val="15"/>
+              </w:rPr>
+              <w:t xml:space="preserve">    classDef gate fill:#FFF6E5,stroke:#D08A00,color:#3A2A00;</w:t>
+            </w:r>
+          </w:p>
+          <w:p>
+            <w:pPr>
+              <w:spacing w:after="0" w:line="240" w:lineRule="auto"/>
+            </w:pPr>
+            <w:r>
+              <w:rPr>
+                <w:rFonts w:ascii="D2Coding" w:hAnsi="D2Coding" w:eastAsia="맑은 고딕" w:cs="D2Coding"/>
+                <w:b w:val="0"/>
+                <w:color w:val="2B2F4A"/>
+                <w:sz w:val="15"/>
+              </w:rPr>
+              <w:t xml:space="preserve">    class VAL,TR,TRL,MK,SH,DM,SY,JD,RWR agent;</w:t>
+            </w:r>
+          </w:p>
+          <w:p>
+            <w:pPr>
+              <w:spacing w:after="0" w:line="240" w:lineRule="auto"/>
+            </w:pPr>
+            <w:r>
+              <w:rPr>
+                <w:rFonts w:ascii="D2Coding" w:hAnsi="D2Coding" w:eastAsia="맑은 고딕" w:cs="D2Coding"/>
+                <w:b w:val="0"/>
+                <w:color w:val="2B2F4A"/>
+                <w:sz w:val="15"/>
+              </w:rPr>
+              <w:t xml:space="preserve">    class INIT,IDX,QP,RET,QRW,PDF util;</w:t>
+            </w:r>
+          </w:p>
+          <w:p>
+            <w:pPr>
+              <w:spacing w:after="0" w:line="240" w:lineRule="auto"/>
+            </w:pPr>
+            <w:r>
+              <w:rPr>
+                <w:rFonts w:ascii="D2Coding" w:hAnsi="D2Coding" w:eastAsia="맑은 고딕" w:cs="D2Coding"/>
+                <w:b w:val="0"/>
+                <w:color w:val="2B2F4A"/>
+                <w:sz w:val="15"/>
+              </w:rPr>
+              <w:t xml:space="preserve">    class H0,END human;</w:t>
+            </w:r>
+          </w:p>
+          <w:p>
+            <w:pPr>
+              <w:spacing w:after="0" w:line="240" w:lineRule="auto"/>
+            </w:pPr>
+            <w:r>
+              <w:rPr>
+                <w:rFonts w:ascii="D2Coding" w:hAnsi="D2Coding" w:eastAsia="맑은 고딕" w:cs="D2Coding"/>
+                <w:b w:val="0"/>
+                <w:color w:val="2B2F4A"/>
+                <w:sz w:val="15"/>
+              </w:rPr>
+              <w:t xml:space="preserve">    class GR,RR,FC gate;</w:t>
+            </w:r>
+          </w:p>
+          <w:p>
+            <w:pPr>
+              <w:spacing w:after="0" w:line="240" w:lineRule="auto"/>
+            </w:pPr>
+            <w:r>
+              <w:rPr>
+                <w:rFonts w:ascii="D2Coding" w:hAnsi="D2Coding" w:eastAsia="맑은 고딕" w:cs="D2Coding"/>
+                <w:b w:val="0"/>
+                <w:color w:val="2B2F4A"/>
+                <w:sz w:val="15"/>
+              </w:rPr>
+              <w:t xml:space="preserve">    style S1 fill:#FBFBFD,stroke:#B8BCCC,color:#161A58</w:t>
+            </w:r>
+          </w:p>
+          <w:p>
+            <w:pPr>
+              <w:spacing w:after="0" w:line="240" w:lineRule="auto"/>
+            </w:pPr>
+            <w:r>
+              <w:rPr>
+                <w:rFonts w:ascii="D2Coding" w:hAnsi="D2Coding" w:eastAsia="맑은 고딕" w:cs="D2Coding"/>
+                <w:b w:val="0"/>
+                <w:color w:val="2B2F4A"/>
+                <w:sz w:val="15"/>
+              </w:rPr>
+              <w:t xml:space="preserve">    style S2 fill:#FBFAFE,stroke:#B9A3E3,color:#161A58</w:t>
+            </w:r>
+          </w:p>
+          <w:p>
+            <w:pPr>
+              <w:spacing w:after="0" w:line="240" w:lineRule="auto"/>
+            </w:pPr>
+            <w:r>
+              <w:rPr>
+                <w:rFonts w:ascii="D2Coding" w:hAnsi="D2Coding" w:eastAsia="맑은 고딕" w:cs="D2Coding"/>
+                <w:b w:val="0"/>
+                <w:color w:val="2B2F4A"/>
+                <w:sz w:val="15"/>
+              </w:rPr>
+              <w:t xml:space="preserve">    style S3 fill:#FFFDF6,stroke:#E3C27A,color:#161A58</w:t>
+            </w:r>
+          </w:p>
+          <w:p>
+            <w:pPr>
+              <w:spacing w:after="0" w:line="240" w:lineRule="auto"/>
+            </w:pPr>
+            <w:r>
+              <w:rPr>
+                <w:rFonts w:ascii="D2Coding" w:hAnsi="D2Coding" w:eastAsia="맑은 고딕" w:cs="D2Coding"/>
+                <w:b w:val="0"/>
+                <w:color w:val="2B2F4A"/>
+                <w:sz w:val="15"/>
+              </w:rPr>
+              <w:t xml:space="preserve">    style S4 fill:#FBFBFD,stroke:#B8BCCC,color:#161A58</w:t>
+            </w:r>
+          </w:p>
+          <w:p>
+            <w:pPr>
+              <w:spacing w:after="0" w:line="240" w:lineRule="auto"/>
+            </w:pPr>
+            <w:r>
+              <w:rPr>
+                <w:rFonts w:ascii="D2Coding" w:hAnsi="D2Coding" w:eastAsia="맑은 고딕" w:cs="D2Coding"/>
+                <w:b w:val="0"/>
+                <w:color w:val="2B2F4A"/>
+                <w:sz w:val="15"/>
+              </w:rPr>
+              <w:t xml:space="preserve">    style FAN fill:#F6F2FD,stroke:#7F4ACB,stroke-dasharray:4 3,color:#161A58</w:t>
             </w:r>
           </w:p>
         </w:tc>

</xml_diff>

<commit_message>
Design: run index_builder before selection_validator (D42)
selection_validator checks the selection against the source papers,
so the index must exist first. Updated figure 2, D.2 state readers,
D.4 rule 1, handoff flow, and rebuilt the design PDF.
</commit_message>
<xml_diff>
--- a/deliverables/RAG-Design_판교-9반_김정인+김진수+전진만+정원준.docx
+++ b/deliverables/RAG-Design_판교-9반_김정인+김진수+전진만+정원준.docx
@@ -19974,7 +19974,7 @@
                 <w:b w:val="0"/>
                 <w:sz w:val="17"/>
               </w:rPr>
-              <w:t>hybrid_retriever, report_writer</w:t>
+              <w:t>selection_validator, hybrid_retriever, report_writer</w:t>
             </w:r>
           </w:p>
         </w:tc>
@@ -23065,7 +23065,7 @@
       <w:r>
         <w:drawing>
           <wp:inline xmlns:a="http://schemas.openxmlformats.org/drawingml/2006/main" xmlns:pic="http://schemas.openxmlformats.org/drawingml/2006/picture">
-            <wp:extent cx="4031999" cy="7104765"/>
+            <wp:extent cx="4031999" cy="6497149"/>
             <wp:docPr id="3" name="Picture 3"/>
             <wp:cNvGraphicFramePr>
               <a:graphicFrameLocks noChangeAspect="1"/>
@@ -23086,7 +23086,7 @@
                   <pic:spPr>
                     <a:xfrm>
                       <a:off x="0" y="0"/>
-                      <a:ext cx="4031999" cy="7104765"/>
+                      <a:ext cx="4031999" cy="6497149"/>
                     </a:xfrm>
                     <a:prstGeom prst="rect"/>
                   </pic:spPr>
@@ -23205,7 +23205,7 @@
                 <w:color w:val="2B2F4A"/>
                 <w:sz w:val="15"/>
               </w:rPr>
-              <w:t xml:space="preserve">        INIT["initialize&lt;br/&gt;State 초기화"] --&gt; VAL["selection_validator&lt;br/&gt;선정 타당성 검증·기록"]</w:t>
+              <w:t xml:space="preserve">        INIT["initialize&lt;br/&gt;State 초기화"] --&gt; IDX["index_builder&lt;br/&gt;PDF 로드·청킹·인덱스"]</w:t>
             </w:r>
           </w:p>
           <w:p>
@@ -23219,7 +23219,7 @@
                 <w:color w:val="2B2F4A"/>
                 <w:sz w:val="15"/>
               </w:rPr>
-              <w:t xml:space="preserve">        VAL --&gt; IDX["index_builder&lt;br/&gt;PDF 로드·청킹·인덱스"]</w:t>
+              <w:t xml:space="preserve">        IDX --&gt; VAL["selection_validator&lt;br/&gt;선정 타당성 검증·기록"]</w:t>
             </w:r>
           </w:p>
           <w:p>
@@ -23233,7 +23233,7 @@
                 <w:color w:val="2B2F4A"/>
                 <w:sz w:val="15"/>
               </w:rPr>
-              <w:t xml:space="preserve">        IDX --&gt; QP["query_planner&lt;br/&gt;기술별 개요 질의"]</w:t>
+              <w:t xml:space="preserve">        VAL --&gt; QP["query_planner&lt;br/&gt;기술별 개요 질의"]</w:t>
             </w:r>
           </w:p>
           <w:p>
@@ -23898,7 +23898,24 @@
           <w:b w:val="0"/>
           <w:sz w:val="20"/>
         </w:rPr>
-        <w:t>는 결과를 기록하고, 충족하지 못한 항목은 경고로 남긴 뒤 항상 다음으로 넘어간다.</w:t>
+        <w:t xml:space="preserve">는 </w:t>
+      </w:r>
+      <w:r>
+        <w:rPr>
+          <w:rFonts w:ascii="D2Coding" w:hAnsi="D2Coding" w:eastAsia="맑은 고딕" w:cs="D2Coding"/>
+          <w:b w:val="0"/>
+          <w:color w:val="5B3FA0"/>
+          <w:sz w:val="19"/>
+        </w:rPr>
+        <w:t>index_builder</w:t>
+      </w:r>
+      <w:r>
+        <w:rPr>
+          <w:rFonts w:ascii="맑은 고딕" w:hAnsi="맑은 고딕" w:eastAsia="맑은 고딕" w:cs="맑은 고딕"/>
+          <w:b w:val="0"/>
+          <w:sz w:val="20"/>
+        </w:rPr>
+        <w:t>가 만든 인덱스에서 원문 근거를 찾아 결과를 기록하고, 충족하지 못한 항목은 경고로 남긴 뒤 항상 다음으로 넘어간다.</w:t>
       </w:r>
     </w:p>
     <w:p>

</xml_diff>

<commit_message>
refactor(design): index_builder 실행 순서 선행으로 변경
</commit_message>
<xml_diff>
--- a/deliverables/RAG-Design_판교-9반_김정인+김진수+전진만+정원준.docx
+++ b/deliverables/RAG-Design_판교-9반_김정인+김진수+전진만+정원준.docx
@@ -19974,7 +19974,7 @@
                 <w:b w:val="0"/>
                 <w:sz w:val="17"/>
               </w:rPr>
-              <w:t>hybrid_retriever, report_writer</w:t>
+              <w:t>selection_validator, hybrid_retriever, report_writer</w:t>
             </w:r>
           </w:p>
         </w:tc>
@@ -23065,7 +23065,7 @@
       <w:r>
         <w:drawing>
           <wp:inline xmlns:a="http://schemas.openxmlformats.org/drawingml/2006/main" xmlns:pic="http://schemas.openxmlformats.org/drawingml/2006/picture">
-            <wp:extent cx="4031999" cy="7104765"/>
+            <wp:extent cx="4031999" cy="6497149"/>
             <wp:docPr id="3" name="Picture 3"/>
             <wp:cNvGraphicFramePr>
               <a:graphicFrameLocks noChangeAspect="1"/>
@@ -23086,7 +23086,7 @@
                   <pic:spPr>
                     <a:xfrm>
                       <a:off x="0" y="0"/>
-                      <a:ext cx="4031999" cy="7104765"/>
+                      <a:ext cx="4031999" cy="6497149"/>
                     </a:xfrm>
                     <a:prstGeom prst="rect"/>
                   </pic:spPr>
@@ -23205,7 +23205,7 @@
                 <w:color w:val="2B2F4A"/>
                 <w:sz w:val="15"/>
               </w:rPr>
-              <w:t xml:space="preserve">        INIT["initialize&lt;br/&gt;State 초기화"] --&gt; VAL["selection_validator&lt;br/&gt;선정 타당성 검증·기록"]</w:t>
+              <w:t xml:space="preserve">        INIT["initialize&lt;br/&gt;State 초기화"] --&gt; IDX["index_builder&lt;br/&gt;PDF 로드·청킹·인덱스"]</w:t>
             </w:r>
           </w:p>
           <w:p>
@@ -23219,7 +23219,7 @@
                 <w:color w:val="2B2F4A"/>
                 <w:sz w:val="15"/>
               </w:rPr>
-              <w:t xml:space="preserve">        VAL --&gt; IDX["index_builder&lt;br/&gt;PDF 로드·청킹·인덱스"]</w:t>
+              <w:t xml:space="preserve">        IDX --&gt; VAL["selection_validator&lt;br/&gt;선정 타당성 검증·기록"]</w:t>
             </w:r>
           </w:p>
           <w:p>
@@ -23233,7 +23233,7 @@
                 <w:color w:val="2B2F4A"/>
                 <w:sz w:val="15"/>
               </w:rPr>
-              <w:t xml:space="preserve">        IDX --&gt; QP["query_planner&lt;br/&gt;기술별 개요 질의"]</w:t>
+              <w:t xml:space="preserve">        VAL --&gt; QP["query_planner&lt;br/&gt;기술별 개요 질의"]</w:t>
             </w:r>
           </w:p>
           <w:p>
@@ -23898,7 +23898,24 @@
           <w:b w:val="0"/>
           <w:sz w:val="20"/>
         </w:rPr>
-        <w:t>는 결과를 기록하고, 충족하지 못한 항목은 경고로 남긴 뒤 항상 다음으로 넘어간다.</w:t>
+        <w:t xml:space="preserve">는 </w:t>
+      </w:r>
+      <w:r>
+        <w:rPr>
+          <w:rFonts w:ascii="D2Coding" w:hAnsi="D2Coding" w:eastAsia="맑은 고딕" w:cs="D2Coding"/>
+          <w:b w:val="0"/>
+          <w:color w:val="5B3FA0"/>
+          <w:sz w:val="19"/>
+        </w:rPr>
+        <w:t>index_builder</w:t>
+      </w:r>
+      <w:r>
+        <w:rPr>
+          <w:rFonts w:ascii="맑은 고딕" w:hAnsi="맑은 고딕" w:eastAsia="맑은 고딕" w:cs="맑은 고딕"/>
+          <w:b w:val="0"/>
+          <w:sz w:val="20"/>
+        </w:rPr>
+        <w:t>가 만든 인덱스에서 원문 근거를 찾아 결과를 기록하고, 충족하지 못한 항목은 경고로 남긴 뒤 항상 다음으로 넘어간다.</w:t>
       </w:r>
     </w:p>
     <w:p>

</xml_diff>